<commit_message>
atualização da aula 01/10/2026
</commit_message>
<xml_diff>
--- a/Apostila/Projeto Space for Men (Recuperação Automática).docx
+++ b/Apostila/Projeto Space for Men (Recuperação Automática).docx
@@ -11183,6 +11183,9 @@
         <w:jc w:val="both"/>
       </w:pPr>
       <w:r>
+        <w:rPr>
+          <w:noProof/>
+        </w:rPr>
         <w:drawing>
           <wp:inline distT="0" distB="0" distL="0" distR="0" wp14:anchorId="4472E705" wp14:editId="38DE4162">
             <wp:extent cx="5400040" cy="676275"/>
@@ -11372,7 +11375,15 @@
     </w:p>
     <w:p>
       <w:r>
-        <w:t xml:space="preserve">Na pagina do </w:t>
+        <w:t xml:space="preserve">Na </w:t>
+      </w:r>
+      <w:proofErr w:type="spellStart"/>
+      <w:r>
+        <w:t>pagina</w:t>
+      </w:r>
+      <w:proofErr w:type="spellEnd"/>
+      <w:r>
+        <w:t xml:space="preserve"> do </w:t>
       </w:r>
       <w:proofErr w:type="spellStart"/>
       <w:r>
@@ -11405,6 +11416,9 @@
         <w:t xml:space="preserve">   </w:t>
       </w:r>
       <w:r>
+        <w:rPr>
+          <w:noProof/>
+        </w:rPr>
         <w:drawing>
           <wp:inline distT="0" distB="0" distL="0" distR="0" wp14:anchorId="2FBD3E70" wp14:editId="46C5D473">
             <wp:extent cx="2463067" cy="2447925"/>
@@ -11563,6 +11577,9 @@
         <w:t xml:space="preserve"> </w:t>
       </w:r>
       <w:r>
+        <w:rPr>
+          <w:noProof/>
+        </w:rPr>
         <w:drawing>
           <wp:inline distT="0" distB="0" distL="0" distR="0" wp14:anchorId="781AE8CC" wp14:editId="15971668">
             <wp:extent cx="1257475" cy="581106"/>
@@ -11632,8 +11649,6 @@
       </w:r>
     </w:p>
     <w:p>
-      <w:bookmarkStart w:id="0" w:name="_GoBack"/>
-      <w:bookmarkEnd w:id="0"/>
       <w:r>
         <w:rPr>
           <w:noProof/>
@@ -11684,6 +11699,903 @@
           </wp:inline>
         </w:drawing>
       </w:r>
+    </w:p>
+    <w:p/>
+    <w:p>
+      <w:r>
+        <w:t>103-</w:t>
+      </w:r>
+      <w:proofErr w:type="gramStart"/>
+      <w:r>
+        <w:t>adicionamos</w:t>
+      </w:r>
+      <w:proofErr w:type="gramEnd"/>
+      <w:r>
+        <w:t xml:space="preserve"> um </w:t>
+      </w:r>
+      <w:proofErr w:type="spellStart"/>
+      <w:r>
+        <w:t>class</w:t>
+      </w:r>
+      <w:proofErr w:type="spellEnd"/>
+      <w:r>
+        <w:t xml:space="preserve"> para lista que está dentro da seção benefícios.</w:t>
+      </w:r>
+    </w:p>
+    <w:p>
+      <w:r>
+        <w:drawing>
+          <wp:inline distT="0" distB="0" distL="0" distR="0" wp14:anchorId="497CFC6E" wp14:editId="4FB8A373">
+            <wp:extent cx="2972215" cy="895475"/>
+            <wp:effectExtent l="0" t="0" r="0" b="0"/>
+            <wp:docPr id="142" name="Imagem 142"/>
+            <wp:cNvGraphicFramePr>
+              <a:graphicFrameLocks xmlns:a="http://schemas.openxmlformats.org/drawingml/2006/main" noChangeAspect="1"/>
+            </wp:cNvGraphicFramePr>
+            <a:graphic xmlns:a="http://schemas.openxmlformats.org/drawingml/2006/main">
+              <a:graphicData uri="http://schemas.openxmlformats.org/drawingml/2006/picture">
+                <pic:pic xmlns:pic="http://schemas.openxmlformats.org/drawingml/2006/picture">
+                  <pic:nvPicPr>
+                    <pic:cNvPr id="1" name=""/>
+                    <pic:cNvPicPr/>
+                  </pic:nvPicPr>
+                  <pic:blipFill>
+                    <a:blip r:embed="rId152"/>
+                    <a:stretch>
+                      <a:fillRect/>
+                    </a:stretch>
+                  </pic:blipFill>
+                  <pic:spPr>
+                    <a:xfrm>
+                      <a:off x="0" y="0"/>
+                      <a:ext cx="2972215" cy="895475"/>
+                    </a:xfrm>
+                    <a:prstGeom prst="rect">
+                      <a:avLst/>
+                    </a:prstGeom>
+                  </pic:spPr>
+                </pic:pic>
+              </a:graphicData>
+            </a:graphic>
+          </wp:inline>
+        </w:drawing>
+      </w:r>
+    </w:p>
+    <w:p/>
+    <w:p>
+      <w:r>
+        <w:t>104-</w:t>
+      </w:r>
+      <w:r>
+        <w:t xml:space="preserve">Após colocar a uma </w:t>
+      </w:r>
+      <w:proofErr w:type="spellStart"/>
+      <w:r>
+        <w:t>class</w:t>
+      </w:r>
+      <w:proofErr w:type="spellEnd"/>
+      <w:r>
+        <w:t xml:space="preserve"> na lista definimos a largura para 40% com intuito de colocar a lista ao lado da imagem benefícios depois mudamos a natureza da lista para ficar </w:t>
+      </w:r>
+      <w:proofErr w:type="spellStart"/>
+      <w:r>
+        <w:t>inline-block</w:t>
+      </w:r>
+      <w:proofErr w:type="spellEnd"/>
+      <w:r>
+        <w:t>, notamos que quanto estamos trabalhando com 100% de espaço:</w:t>
+      </w:r>
+    </w:p>
+    <w:p>
+      <w:pPr>
+        <w:pStyle w:val="PargrafodaLista"/>
+        <w:numPr>
+          <w:ilvl w:val="0"/>
+          <w:numId w:val="1"/>
+        </w:numPr>
+      </w:pPr>
+      <w:r>
+        <w:t xml:space="preserve">Lista com 40% de largura </w:t>
+      </w:r>
+    </w:p>
+    <w:p>
+      <w:pPr>
+        <w:pStyle w:val="PargrafodaLista"/>
+        <w:numPr>
+          <w:ilvl w:val="0"/>
+          <w:numId w:val="1"/>
+        </w:numPr>
+      </w:pPr>
+      <w:r>
+        <w:t>A imagem com 60% de largura</w:t>
+      </w:r>
+    </w:p>
+    <w:p>
+      <w:r>
+        <w:t xml:space="preserve">Se faz necessário não deixar espaço no </w:t>
+      </w:r>
+      <w:proofErr w:type="spellStart"/>
+      <w:r>
+        <w:t>html</w:t>
+      </w:r>
+      <w:proofErr w:type="spellEnd"/>
+      <w:r>
+        <w:t xml:space="preserve"> entre a lista e a imagem</w:t>
+      </w:r>
+    </w:p>
+    <w:p>
+      <w:r>
+        <w:drawing>
+          <wp:inline distT="0" distB="0" distL="0" distR="0" wp14:anchorId="6769A65B" wp14:editId="5F0E4550">
+            <wp:extent cx="1457528" cy="1400370"/>
+            <wp:effectExtent l="0" t="0" r="9525" b="9525"/>
+            <wp:docPr id="145" name="Imagem 145"/>
+            <wp:cNvGraphicFramePr>
+              <a:graphicFrameLocks xmlns:a="http://schemas.openxmlformats.org/drawingml/2006/main" noChangeAspect="1"/>
+            </wp:cNvGraphicFramePr>
+            <a:graphic xmlns:a="http://schemas.openxmlformats.org/drawingml/2006/main">
+              <a:graphicData uri="http://schemas.openxmlformats.org/drawingml/2006/picture">
+                <pic:pic xmlns:pic="http://schemas.openxmlformats.org/drawingml/2006/picture">
+                  <pic:nvPicPr>
+                    <pic:cNvPr id="1" name=""/>
+                    <pic:cNvPicPr/>
+                  </pic:nvPicPr>
+                  <pic:blipFill>
+                    <a:blip r:embed="rId153"/>
+                    <a:stretch>
+                      <a:fillRect/>
+                    </a:stretch>
+                  </pic:blipFill>
+                  <pic:spPr>
+                    <a:xfrm>
+                      <a:off x="0" y="0"/>
+                      <a:ext cx="1457528" cy="1400370"/>
+                    </a:xfrm>
+                    <a:prstGeom prst="rect">
+                      <a:avLst/>
+                    </a:prstGeom>
+                  </pic:spPr>
+                </pic:pic>
+              </a:graphicData>
+            </a:graphic>
+          </wp:inline>
+        </w:drawing>
+      </w:r>
+      <w:r>
+        <w:t xml:space="preserve">   </w:t>
+      </w:r>
+      <w:r>
+        <w:rPr>
+          <w:noProof/>
+        </w:rPr>
+        <w:drawing>
+          <wp:inline distT="0" distB="0" distL="0" distR="0" wp14:anchorId="09B84673">
+            <wp:extent cx="3821766" cy="1143075"/>
+            <wp:effectExtent l="0" t="0" r="7620" b="0"/>
+            <wp:docPr id="146" name="Imagem 146"/>
+            <wp:cNvGraphicFramePr>
+              <a:graphicFrameLocks xmlns:a="http://schemas.openxmlformats.org/drawingml/2006/main" noChangeAspect="1"/>
+            </wp:cNvGraphicFramePr>
+            <a:graphic xmlns:a="http://schemas.openxmlformats.org/drawingml/2006/main">
+              <a:graphicData uri="http://schemas.openxmlformats.org/drawingml/2006/picture">
+                <pic:pic xmlns:pic="http://schemas.openxmlformats.org/drawingml/2006/picture">
+                  <pic:nvPicPr>
+                    <pic:cNvPr id="0" name="Picture 2"/>
+                    <pic:cNvPicPr>
+                      <a:picLocks noChangeAspect="1" noChangeArrowheads="1"/>
+                    </pic:cNvPicPr>
+                  </pic:nvPicPr>
+                  <pic:blipFill>
+                    <a:blip r:embed="rId154">
+                      <a:extLst>
+                        <a:ext uri="{28A0092B-C50C-407E-A947-70E740481C1C}">
+                          <a14:useLocalDpi xmlns:a14="http://schemas.microsoft.com/office/drawing/2010/main" val="0"/>
+                        </a:ext>
+                      </a:extLst>
+                    </a:blip>
+                    <a:srcRect/>
+                    <a:stretch>
+                      <a:fillRect/>
+                    </a:stretch>
+                  </pic:blipFill>
+                  <pic:spPr bwMode="auto">
+                    <a:xfrm>
+                      <a:off x="0" y="0"/>
+                      <a:ext cx="3895085" cy="1165005"/>
+                    </a:xfrm>
+                    <a:prstGeom prst="rect">
+                      <a:avLst/>
+                    </a:prstGeom>
+                    <a:noFill/>
+                  </pic:spPr>
+                </pic:pic>
+              </a:graphicData>
+            </a:graphic>
+          </wp:inline>
+        </w:drawing>
+      </w:r>
+    </w:p>
+    <w:p/>
+    <w:p>
+      <w:r>
+        <w:t>105-</w:t>
+      </w:r>
+      <w:r>
+        <w:t xml:space="preserve">Alinhamos a lista no topo da imagem </w:t>
+      </w:r>
+      <w:r>
+        <w:t>utilizado vertical-</w:t>
+      </w:r>
+      <w:proofErr w:type="spellStart"/>
+      <w:r>
+        <w:t>align</w:t>
+      </w:r>
+      <w:proofErr w:type="spellEnd"/>
+      <w:r>
+        <w:t>: top, incluímos mais dois itens da lista.</w:t>
+      </w:r>
+    </w:p>
+    <w:p>
+      <w:r>
+        <w:rPr>
+          <w:noProof/>
+        </w:rPr>
+        <w:drawing>
+          <wp:inline distT="0" distB="0" distL="0" distR="0" wp14:anchorId="3BF4ACA0">
+            <wp:extent cx="1352550" cy="1304925"/>
+            <wp:effectExtent l="0" t="0" r="0" b="9525"/>
+            <wp:docPr id="147" name="Imagem 147"/>
+            <wp:cNvGraphicFramePr>
+              <a:graphicFrameLocks xmlns:a="http://schemas.openxmlformats.org/drawingml/2006/main" noChangeAspect="1"/>
+            </wp:cNvGraphicFramePr>
+            <a:graphic xmlns:a="http://schemas.openxmlformats.org/drawingml/2006/main">
+              <a:graphicData uri="http://schemas.openxmlformats.org/drawingml/2006/picture">
+                <pic:pic xmlns:pic="http://schemas.openxmlformats.org/drawingml/2006/picture">
+                  <pic:nvPicPr>
+                    <pic:cNvPr id="0" name="Picture 3"/>
+                    <pic:cNvPicPr>
+                      <a:picLocks noChangeAspect="1" noChangeArrowheads="1"/>
+                    </pic:cNvPicPr>
+                  </pic:nvPicPr>
+                  <pic:blipFill>
+                    <a:blip r:embed="rId155">
+                      <a:extLst>
+                        <a:ext uri="{28A0092B-C50C-407E-A947-70E740481C1C}">
+                          <a14:useLocalDpi xmlns:a14="http://schemas.microsoft.com/office/drawing/2010/main" val="0"/>
+                        </a:ext>
+                      </a:extLst>
+                    </a:blip>
+                    <a:srcRect/>
+                    <a:stretch>
+                      <a:fillRect/>
+                    </a:stretch>
+                  </pic:blipFill>
+                  <pic:spPr bwMode="auto">
+                    <a:xfrm>
+                      <a:off x="0" y="0"/>
+                      <a:ext cx="1352550" cy="1304925"/>
+                    </a:xfrm>
+                    <a:prstGeom prst="rect">
+                      <a:avLst/>
+                    </a:prstGeom>
+                    <a:noFill/>
+                  </pic:spPr>
+                </pic:pic>
+              </a:graphicData>
+            </a:graphic>
+          </wp:inline>
+        </w:drawing>
+      </w:r>
+      <w:r>
+        <w:rPr>
+          <w:noProof/>
+        </w:rPr>
+        <w:drawing>
+          <wp:inline distT="0" distB="0" distL="0" distR="0" wp14:anchorId="2754BCE2">
+            <wp:extent cx="4025208" cy="1793856"/>
+            <wp:effectExtent l="0" t="0" r="0" b="0"/>
+            <wp:docPr id="148" name="Imagem 148"/>
+            <wp:cNvGraphicFramePr>
+              <a:graphicFrameLocks xmlns:a="http://schemas.openxmlformats.org/drawingml/2006/main" noChangeAspect="1"/>
+            </wp:cNvGraphicFramePr>
+            <a:graphic xmlns:a="http://schemas.openxmlformats.org/drawingml/2006/main">
+              <a:graphicData uri="http://schemas.openxmlformats.org/drawingml/2006/picture">
+                <pic:pic xmlns:pic="http://schemas.openxmlformats.org/drawingml/2006/picture">
+                  <pic:nvPicPr>
+                    <pic:cNvPr id="0" name="Picture 4"/>
+                    <pic:cNvPicPr>
+                      <a:picLocks noChangeAspect="1" noChangeArrowheads="1"/>
+                    </pic:cNvPicPr>
+                  </pic:nvPicPr>
+                  <pic:blipFill>
+                    <a:blip r:embed="rId156">
+                      <a:extLst>
+                        <a:ext uri="{28A0092B-C50C-407E-A947-70E740481C1C}">
+                          <a14:useLocalDpi xmlns:a14="http://schemas.microsoft.com/office/drawing/2010/main" val="0"/>
+                        </a:ext>
+                      </a:extLst>
+                    </a:blip>
+                    <a:srcRect/>
+                    <a:stretch>
+                      <a:fillRect/>
+                    </a:stretch>
+                  </pic:blipFill>
+                  <pic:spPr bwMode="auto">
+                    <a:xfrm>
+                      <a:off x="0" y="0"/>
+                      <a:ext cx="4562433" cy="2033273"/>
+                    </a:xfrm>
+                    <a:prstGeom prst="rect">
+                      <a:avLst/>
+                    </a:prstGeom>
+                    <a:noFill/>
+                  </pic:spPr>
+                </pic:pic>
+              </a:graphicData>
+            </a:graphic>
+          </wp:inline>
+        </w:drawing>
+      </w:r>
+    </w:p>
+    <w:p>
+      <w:pPr>
+        <w:rPr>
+          <w:i/>
+        </w:rPr>
+      </w:pPr>
+      <w:r>
+        <w:t>106-</w:t>
+      </w:r>
+      <w:r>
+        <w:rPr>
+          <w:i/>
+        </w:rPr>
+        <w:t xml:space="preserve">Na lista queremos que o primeiro item ficasse em </w:t>
+      </w:r>
+      <w:r>
+        <w:rPr>
+          <w:i/>
+        </w:rPr>
+        <w:t>in</w:t>
+      </w:r>
+      <w:r>
+        <w:rPr>
+          <w:i/>
+        </w:rPr>
+        <w:t xml:space="preserve">corporado e negrito para isso utilizamos o </w:t>
+      </w:r>
+      <w:proofErr w:type="spellStart"/>
+      <w:r>
+        <w:rPr>
+          <w:i/>
+        </w:rPr>
+        <w:t>fist-child</w:t>
+      </w:r>
+      <w:proofErr w:type="spellEnd"/>
+      <w:r>
+        <w:rPr>
+          <w:i/>
+        </w:rPr>
+        <w:t xml:space="preserve"> que significa o primeiro filho conforme código a baixo.</w:t>
+      </w:r>
+    </w:p>
+    <w:p>
+      <w:pPr>
+        <w:rPr>
+          <w:i/>
+        </w:rPr>
+      </w:pPr>
+      <w:r>
+        <w:rPr>
+          <w:i/>
+          <w:noProof/>
+        </w:rPr>
+        <w:drawing>
+          <wp:inline distT="0" distB="0" distL="0" distR="0" wp14:anchorId="28D0BDFF">
+            <wp:extent cx="2331352" cy="1009402"/>
+            <wp:effectExtent l="0" t="0" r="0" b="635"/>
+            <wp:docPr id="149" name="Imagem 149"/>
+            <wp:cNvGraphicFramePr>
+              <a:graphicFrameLocks xmlns:a="http://schemas.openxmlformats.org/drawingml/2006/main" noChangeAspect="1"/>
+            </wp:cNvGraphicFramePr>
+            <a:graphic xmlns:a="http://schemas.openxmlformats.org/drawingml/2006/main">
+              <a:graphicData uri="http://schemas.openxmlformats.org/drawingml/2006/picture">
+                <pic:pic xmlns:pic="http://schemas.openxmlformats.org/drawingml/2006/picture">
+                  <pic:nvPicPr>
+                    <pic:cNvPr id="0" name="Picture 5"/>
+                    <pic:cNvPicPr>
+                      <a:picLocks noChangeAspect="1" noChangeArrowheads="1"/>
+                    </pic:cNvPicPr>
+                  </pic:nvPicPr>
+                  <pic:blipFill>
+                    <a:blip r:embed="rId157">
+                      <a:extLst>
+                        <a:ext uri="{28A0092B-C50C-407E-A947-70E740481C1C}">
+                          <a14:useLocalDpi xmlns:a14="http://schemas.microsoft.com/office/drawing/2010/main" val="0"/>
+                        </a:ext>
+                      </a:extLst>
+                    </a:blip>
+                    <a:srcRect/>
+                    <a:stretch>
+                      <a:fillRect/>
+                    </a:stretch>
+                  </pic:blipFill>
+                  <pic:spPr bwMode="auto">
+                    <a:xfrm>
+                      <a:off x="0" y="0"/>
+                      <a:ext cx="2399429" cy="1038877"/>
+                    </a:xfrm>
+                    <a:prstGeom prst="rect">
+                      <a:avLst/>
+                    </a:prstGeom>
+                    <a:noFill/>
+                  </pic:spPr>
+                </pic:pic>
+              </a:graphicData>
+            </a:graphic>
+          </wp:inline>
+        </w:drawing>
+      </w:r>
+      <w:r>
+        <w:rPr>
+          <w:i/>
+        </w:rPr>
+        <w:t xml:space="preserve"> </w:t>
+      </w:r>
+      <w:r>
+        <w:rPr>
+          <w:i/>
+          <w:noProof/>
+        </w:rPr>
+        <w:drawing>
+          <wp:inline distT="0" distB="0" distL="0" distR="0" wp14:anchorId="0902FF56">
+            <wp:extent cx="1733550" cy="1076325"/>
+            <wp:effectExtent l="0" t="0" r="0" b="9525"/>
+            <wp:docPr id="150" name="Imagem 150"/>
+            <wp:cNvGraphicFramePr>
+              <a:graphicFrameLocks xmlns:a="http://schemas.openxmlformats.org/drawingml/2006/main" noChangeAspect="1"/>
+            </wp:cNvGraphicFramePr>
+            <a:graphic xmlns:a="http://schemas.openxmlformats.org/drawingml/2006/main">
+              <a:graphicData uri="http://schemas.openxmlformats.org/drawingml/2006/picture">
+                <pic:pic xmlns:pic="http://schemas.openxmlformats.org/drawingml/2006/picture">
+                  <pic:nvPicPr>
+                    <pic:cNvPr id="0" name="Picture 6"/>
+                    <pic:cNvPicPr>
+                      <a:picLocks noChangeAspect="1" noChangeArrowheads="1"/>
+                    </pic:cNvPicPr>
+                  </pic:nvPicPr>
+                  <pic:blipFill>
+                    <a:blip r:embed="rId158">
+                      <a:extLst>
+                        <a:ext uri="{28A0092B-C50C-407E-A947-70E740481C1C}">
+                          <a14:useLocalDpi xmlns:a14="http://schemas.microsoft.com/office/drawing/2010/main" val="0"/>
+                        </a:ext>
+                      </a:extLst>
+                    </a:blip>
+                    <a:srcRect/>
+                    <a:stretch>
+                      <a:fillRect/>
+                    </a:stretch>
+                  </pic:blipFill>
+                  <pic:spPr bwMode="auto">
+                    <a:xfrm>
+                      <a:off x="0" y="0"/>
+                      <a:ext cx="1733550" cy="1076325"/>
+                    </a:xfrm>
+                    <a:prstGeom prst="rect">
+                      <a:avLst/>
+                    </a:prstGeom>
+                    <a:noFill/>
+                  </pic:spPr>
+                </pic:pic>
+              </a:graphicData>
+            </a:graphic>
+          </wp:inline>
+        </w:drawing>
+      </w:r>
+    </w:p>
+    <w:p>
+      <w:pPr>
+        <w:rPr>
+          <w:i/>
+        </w:rPr>
+      </w:pPr>
+    </w:p>
+    <w:p>
+      <w:pPr>
+        <w:rPr>
+          <w:i/>
+        </w:rPr>
+      </w:pPr>
+      <w:r>
+        <w:rPr>
+          <w:i/>
+        </w:rPr>
+        <w:t>107-</w:t>
+      </w:r>
+      <w:r>
+        <w:rPr>
+          <w:i/>
+        </w:rPr>
+        <w:t xml:space="preserve">Adicionamos </w:t>
+      </w:r>
+      <w:r>
+        <w:rPr>
+          <w:i/>
+        </w:rPr>
+        <w:t>um ícone de estrela na nossa lista benefícios:</w:t>
+      </w:r>
+    </w:p>
+    <w:p>
+      <w:pPr>
+        <w:rPr>
+          <w:i/>
+        </w:rPr>
+      </w:pPr>
+    </w:p>
+    <w:p>
+      <w:pPr>
+        <w:rPr>
+          <w:i/>
+        </w:rPr>
+      </w:pPr>
+      <w:r>
+        <w:rPr>
+          <w:i/>
+        </w:rPr>
+        <w:t>Acessemos o site que contenha o ícone de estrela negra</w:t>
+      </w:r>
+    </w:p>
+    <w:p>
+      <w:pPr>
+        <w:rPr>
+          <w:i/>
+        </w:rPr>
+      </w:pPr>
+      <w:hyperlink r:id="rId159" w:history="1">
+        <w:r>
+          <w:rPr>
+            <w:rStyle w:val="Hyperlink"/>
+            <w:i/>
+          </w:rPr>
+          <w:t>https://www.compart.com/en/unicode/U+2605</w:t>
+        </w:r>
+      </w:hyperlink>
+      <w:r>
+        <w:rPr>
+          <w:i/>
+        </w:rPr>
+        <w:t xml:space="preserve"> </w:t>
+      </w:r>
+    </w:p>
+    <w:p>
+      <w:pPr>
+        <w:rPr>
+          <w:i/>
+        </w:rPr>
+      </w:pPr>
+      <w:r>
+        <w:rPr>
+          <w:i/>
+        </w:rPr>
+        <w:t>Copiamos o símbolo e colocamos em nosso código conforme imagem a baixo.</w:t>
+      </w:r>
+    </w:p>
+    <w:p>
+      <w:pPr>
+        <w:rPr>
+          <w:i/>
+        </w:rPr>
+      </w:pPr>
+      <w:r>
+        <w:rPr>
+          <w:i/>
+        </w:rPr>
+        <w:drawing>
+          <wp:inline distT="0" distB="0" distL="0" distR="0" wp14:anchorId="58E0B2CC" wp14:editId="09A369C7">
+            <wp:extent cx="1678339" cy="961587"/>
+            <wp:effectExtent l="0" t="0" r="0" b="0"/>
+            <wp:docPr id="151" name="Imagem 151"/>
+            <wp:cNvGraphicFramePr>
+              <a:graphicFrameLocks xmlns:a="http://schemas.openxmlformats.org/drawingml/2006/main" noChangeAspect="1"/>
+            </wp:cNvGraphicFramePr>
+            <a:graphic xmlns:a="http://schemas.openxmlformats.org/drawingml/2006/main">
+              <a:graphicData uri="http://schemas.openxmlformats.org/drawingml/2006/picture">
+                <pic:pic xmlns:pic="http://schemas.openxmlformats.org/drawingml/2006/picture">
+                  <pic:nvPicPr>
+                    <pic:cNvPr id="1" name=""/>
+                    <pic:cNvPicPr/>
+                  </pic:nvPicPr>
+                  <pic:blipFill>
+                    <a:blip r:embed="rId160"/>
+                    <a:stretch>
+                      <a:fillRect/>
+                    </a:stretch>
+                  </pic:blipFill>
+                  <pic:spPr>
+                    <a:xfrm>
+                      <a:off x="0" y="0"/>
+                      <a:ext cx="1706966" cy="977988"/>
+                    </a:xfrm>
+                    <a:prstGeom prst="rect">
+                      <a:avLst/>
+                    </a:prstGeom>
+                  </pic:spPr>
+                </pic:pic>
+              </a:graphicData>
+            </a:graphic>
+          </wp:inline>
+        </w:drawing>
+      </w:r>
+      <w:r>
+        <w:rPr>
+          <w:i/>
+        </w:rPr>
+        <w:t xml:space="preserve">      </w:t>
+      </w:r>
+      <w:r>
+        <w:rPr>
+          <w:i/>
+          <w:noProof/>
+        </w:rPr>
+        <w:drawing>
+          <wp:inline distT="0" distB="0" distL="0" distR="0" wp14:anchorId="5E65BFF7">
+            <wp:extent cx="1724025" cy="1000125"/>
+            <wp:effectExtent l="0" t="0" r="9525" b="9525"/>
+            <wp:docPr id="152" name="Imagem 152"/>
+            <wp:cNvGraphicFramePr>
+              <a:graphicFrameLocks xmlns:a="http://schemas.openxmlformats.org/drawingml/2006/main" noChangeAspect="1"/>
+            </wp:cNvGraphicFramePr>
+            <a:graphic xmlns:a="http://schemas.openxmlformats.org/drawingml/2006/main">
+              <a:graphicData uri="http://schemas.openxmlformats.org/drawingml/2006/picture">
+                <pic:pic xmlns:pic="http://schemas.openxmlformats.org/drawingml/2006/picture">
+                  <pic:nvPicPr>
+                    <pic:cNvPr id="0" name="Picture 7"/>
+                    <pic:cNvPicPr>
+                      <a:picLocks noChangeAspect="1" noChangeArrowheads="1"/>
+                    </pic:cNvPicPr>
+                  </pic:nvPicPr>
+                  <pic:blipFill>
+                    <a:blip r:embed="rId161">
+                      <a:extLst>
+                        <a:ext uri="{28A0092B-C50C-407E-A947-70E740481C1C}">
+                          <a14:useLocalDpi xmlns:a14="http://schemas.microsoft.com/office/drawing/2010/main" val="0"/>
+                        </a:ext>
+                      </a:extLst>
+                    </a:blip>
+                    <a:srcRect/>
+                    <a:stretch>
+                      <a:fillRect/>
+                    </a:stretch>
+                  </pic:blipFill>
+                  <pic:spPr bwMode="auto">
+                    <a:xfrm>
+                      <a:off x="0" y="0"/>
+                      <a:ext cx="1724025" cy="1000125"/>
+                    </a:xfrm>
+                    <a:prstGeom prst="rect">
+                      <a:avLst/>
+                    </a:prstGeom>
+                    <a:noFill/>
+                  </pic:spPr>
+                </pic:pic>
+              </a:graphicData>
+            </a:graphic>
+          </wp:inline>
+        </w:drawing>
+      </w:r>
+    </w:p>
+    <w:p>
+      <w:pPr>
+        <w:rPr>
+          <w:i/>
+        </w:rPr>
+      </w:pPr>
+    </w:p>
+    <w:p>
+      <w:pPr>
+        <w:rPr>
+          <w:i/>
+        </w:rPr>
+      </w:pPr>
+      <w:r>
+        <w:rPr>
+          <w:i/>
+        </w:rPr>
+        <w:t>108-</w:t>
+      </w:r>
+      <w:r>
+        <w:rPr>
+          <w:i/>
+        </w:rPr>
+        <w:t>Aumentamos o espaço interno da seção benefícios para cima e para baixo</w:t>
+      </w:r>
+    </w:p>
+    <w:p>
+      <w:pPr>
+        <w:rPr>
+          <w:i/>
+        </w:rPr>
+      </w:pPr>
+      <w:r>
+        <w:rPr>
+          <w:i/>
+          <w:noProof/>
+        </w:rPr>
+        <w:drawing>
+          <wp:inline distT="0" distB="0" distL="0" distR="0" wp14:anchorId="0DAFED34">
+            <wp:extent cx="2142710" cy="866898"/>
+            <wp:effectExtent l="0" t="0" r="0" b="9525"/>
+            <wp:docPr id="153" name="Imagem 153"/>
+            <wp:cNvGraphicFramePr>
+              <a:graphicFrameLocks xmlns:a="http://schemas.openxmlformats.org/drawingml/2006/main" noChangeAspect="1"/>
+            </wp:cNvGraphicFramePr>
+            <a:graphic xmlns:a="http://schemas.openxmlformats.org/drawingml/2006/main">
+              <a:graphicData uri="http://schemas.openxmlformats.org/drawingml/2006/picture">
+                <pic:pic xmlns:pic="http://schemas.openxmlformats.org/drawingml/2006/picture">
+                  <pic:nvPicPr>
+                    <pic:cNvPr id="0" name="Picture 8"/>
+                    <pic:cNvPicPr>
+                      <a:picLocks noChangeAspect="1" noChangeArrowheads="1"/>
+                    </pic:cNvPicPr>
+                  </pic:nvPicPr>
+                  <pic:blipFill>
+                    <a:blip r:embed="rId162">
+                      <a:extLst>
+                        <a:ext uri="{28A0092B-C50C-407E-A947-70E740481C1C}">
+                          <a14:useLocalDpi xmlns:a14="http://schemas.microsoft.com/office/drawing/2010/main" val="0"/>
+                        </a:ext>
+                      </a:extLst>
+                    </a:blip>
+                    <a:srcRect/>
+                    <a:stretch>
+                      <a:fillRect/>
+                    </a:stretch>
+                  </pic:blipFill>
+                  <pic:spPr bwMode="auto">
+                    <a:xfrm>
+                      <a:off x="0" y="0"/>
+                      <a:ext cx="2180839" cy="882324"/>
+                    </a:xfrm>
+                    <a:prstGeom prst="rect">
+                      <a:avLst/>
+                    </a:prstGeom>
+                    <a:noFill/>
+                  </pic:spPr>
+                </pic:pic>
+              </a:graphicData>
+            </a:graphic>
+          </wp:inline>
+        </w:drawing>
+      </w:r>
+    </w:p>
+    <w:p>
+      <w:pPr>
+        <w:rPr>
+          <w:i/>
+        </w:rPr>
+      </w:pPr>
+    </w:p>
+    <w:p>
+      <w:pPr>
+        <w:rPr>
+          <w:i/>
+        </w:rPr>
+      </w:pPr>
+      <w:r>
+        <w:rPr>
+          <w:i/>
+        </w:rPr>
+        <w:t xml:space="preserve">109-No </w:t>
+      </w:r>
+      <w:proofErr w:type="spellStart"/>
+      <w:r>
+        <w:rPr>
+          <w:i/>
+        </w:rPr>
+        <w:t>div</w:t>
+      </w:r>
+      <w:proofErr w:type="spellEnd"/>
+      <w:r>
+        <w:rPr>
+          <w:i/>
+        </w:rPr>
+        <w:t xml:space="preserve"> que contem a lista e a imagem benefícios e demos um largura e centralizamos o item </w:t>
+      </w:r>
+      <w:proofErr w:type="gramStart"/>
+      <w:r>
+        <w:rPr>
+          <w:i/>
+        </w:rPr>
+        <w:t>( a</w:t>
+      </w:r>
+      <w:proofErr w:type="gramEnd"/>
+      <w:r>
+        <w:rPr>
+          <w:i/>
+        </w:rPr>
+        <w:t xml:space="preserve"> lista e a imagem) conforme código.</w:t>
+      </w:r>
+    </w:p>
+    <w:p>
+      <w:pPr>
+        <w:rPr>
+          <w:i/>
+        </w:rPr>
+      </w:pPr>
+      <w:r>
+        <w:rPr>
+          <w:i/>
+          <w:noProof/>
+        </w:rPr>
+        <w:drawing>
+          <wp:inline distT="0" distB="0" distL="0" distR="0" wp14:anchorId="7996BD48">
+            <wp:extent cx="1840675" cy="1051814"/>
+            <wp:effectExtent l="0" t="0" r="7620" b="0"/>
+            <wp:docPr id="154" name="Imagem 154"/>
+            <wp:cNvGraphicFramePr>
+              <a:graphicFrameLocks xmlns:a="http://schemas.openxmlformats.org/drawingml/2006/main" noChangeAspect="1"/>
+            </wp:cNvGraphicFramePr>
+            <a:graphic xmlns:a="http://schemas.openxmlformats.org/drawingml/2006/main">
+              <a:graphicData uri="http://schemas.openxmlformats.org/drawingml/2006/picture">
+                <pic:pic xmlns:pic="http://schemas.openxmlformats.org/drawingml/2006/picture">
+                  <pic:nvPicPr>
+                    <pic:cNvPr id="0" name="Picture 9"/>
+                    <pic:cNvPicPr>
+                      <a:picLocks noChangeAspect="1" noChangeArrowheads="1"/>
+                    </pic:cNvPicPr>
+                  </pic:nvPicPr>
+                  <pic:blipFill>
+                    <a:blip r:embed="rId163">
+                      <a:extLst>
+                        <a:ext uri="{28A0092B-C50C-407E-A947-70E740481C1C}">
+                          <a14:useLocalDpi xmlns:a14="http://schemas.microsoft.com/office/drawing/2010/main" val="0"/>
+                        </a:ext>
+                      </a:extLst>
+                    </a:blip>
+                    <a:srcRect/>
+                    <a:stretch>
+                      <a:fillRect/>
+                    </a:stretch>
+                  </pic:blipFill>
+                  <pic:spPr bwMode="auto">
+                    <a:xfrm>
+                      <a:off x="0" y="0"/>
+                      <a:ext cx="1861893" cy="1063939"/>
+                    </a:xfrm>
+                    <a:prstGeom prst="rect">
+                      <a:avLst/>
+                    </a:prstGeom>
+                    <a:noFill/>
+                  </pic:spPr>
+                </pic:pic>
+              </a:graphicData>
+            </a:graphic>
+          </wp:inline>
+        </w:drawing>
+      </w:r>
+    </w:p>
+    <w:p>
+      <w:pPr>
+        <w:rPr>
+          <w:i/>
+        </w:rPr>
+      </w:pPr>
+    </w:p>
+    <w:p>
+      <w:pPr>
+        <w:rPr>
+          <w:i/>
+        </w:rPr>
+      </w:pPr>
+      <w:r>
+        <w:rPr>
+          <w:i/>
+        </w:rPr>
+        <w:t>110-</w:t>
+      </w:r>
+      <w:bookmarkStart w:id="0" w:name="_GoBack"/>
+      <w:bookmarkEnd w:id="0"/>
     </w:p>
     <w:sectPr>
       <w:pgSz w:w="11906" w:h="16838"/>
@@ -12668,7 +13580,7 @@
 </file>
 
 <file path=customXml/itemProps1.xml><?xml version="1.0" encoding="utf-8"?>
-<ds:datastoreItem xmlns:ds="http://schemas.openxmlformats.org/officeDocument/2006/customXml" ds:itemID="{D31619BD-21AE-49B6-8FDB-BB2EB780736F}">
+<ds:datastoreItem xmlns:ds="http://schemas.openxmlformats.org/officeDocument/2006/customXml" ds:itemID="{E21A71DD-2927-4CFA-A459-7176BCB1FB34}">
   <ds:schemaRefs>
     <ds:schemaRef ds:uri="http://schemas.openxmlformats.org/officeDocument/2006/bibliography"/>
   </ds:schemaRefs>

</xml_diff>

<commit_message>
atualização da aula 06/10/2026
</commit_message>
<xml_diff>
--- a/Apostila/Projeto Space for Men (Recuperação Automática).docx
+++ b/Apostila/Projeto Space for Men (Recuperação Automática).docx
@@ -6,6 +6,8 @@
       <w:pPr>
         <w:jc w:val="center"/>
       </w:pPr>
+      <w:bookmarkStart w:id="0" w:name="_Hlk242170586"/>
+      <w:bookmarkStart w:id="1" w:name="_GoBack"/>
       <w:r>
         <w:t xml:space="preserve">Projeto Space for </w:t>
       </w:r>
@@ -11724,6 +11726,9 @@
     </w:p>
     <w:p>
       <w:r>
+        <w:rPr>
+          <w:noProof/>
+        </w:rPr>
         <w:drawing>
           <wp:inline distT="0" distB="0" distL="0" distR="0" wp14:anchorId="497CFC6E" wp14:editId="4FB8A373">
             <wp:extent cx="2972215" cy="895475"/>
@@ -11825,6 +11830,9 @@
     </w:p>
     <w:p>
       <w:r>
+        <w:rPr>
+          <w:noProof/>
+        </w:rPr>
         <w:drawing>
           <wp:inline distT="0" distB="0" distL="0" distR="0" wp14:anchorId="6769A65B" wp14:editId="5F0E4550">
             <wp:extent cx="1457528" cy="1400370"/>
@@ -12290,6 +12298,7 @@
       <w:r>
         <w:rPr>
           <w:i/>
+          <w:noProof/>
         </w:rPr>
         <w:drawing>
           <wp:inline distT="0" distB="0" distL="0" distR="0" wp14:anchorId="58E0B2CC" wp14:editId="09A369C7">
@@ -12500,7 +12509,21 @@
         <w:rPr>
           <w:i/>
         </w:rPr>
-        <w:t xml:space="preserve"> que contem a lista e a imagem benefícios e demos um largura e centralizamos o item </w:t>
+        <w:t xml:space="preserve"> que </w:t>
+      </w:r>
+      <w:proofErr w:type="spellStart"/>
+      <w:r>
+        <w:rPr>
+          <w:i/>
+        </w:rPr>
+        <w:t>contem</w:t>
+      </w:r>
+      <w:proofErr w:type="spellEnd"/>
+      <w:r>
+        <w:rPr>
+          <w:i/>
+        </w:rPr>
+        <w:t xml:space="preserve"> a lista e a imagem benefícios e demos um largura e centralizamos o item </w:t>
       </w:r>
       <w:proofErr w:type="gramStart"/>
       <w:r>
@@ -12588,14 +12611,1336 @@
           <w:i/>
         </w:rPr>
       </w:pPr>
+    </w:p>
+    <w:p>
+      <w:pPr>
+        <w:rPr>
+          <w:i/>
+        </w:rPr>
+      </w:pPr>
       <w:r>
         <w:rPr>
           <w:i/>
         </w:rPr>
         <w:t>110-</w:t>
       </w:r>
-      <w:bookmarkStart w:id="0" w:name="_GoBack"/>
-      <w:bookmarkEnd w:id="0"/>
+      <w:r>
+        <w:rPr>
+          <w:i/>
+        </w:rPr>
+        <w:t xml:space="preserve"> Aumentamos o espaço interno da </w:t>
+      </w:r>
+      <w:proofErr w:type="spellStart"/>
+      <w:r>
+        <w:rPr>
+          <w:i/>
+        </w:rPr>
+        <w:t>section</w:t>
+      </w:r>
+      <w:proofErr w:type="spellEnd"/>
+      <w:r>
+        <w:rPr>
+          <w:i/>
+        </w:rPr>
+        <w:t xml:space="preserve"> principal e adicionamos uma cor de fundo para fazer um degrade ou seja é área onde duas ou mais cores são sobrecarregados.</w:t>
+      </w:r>
+    </w:p>
+    <w:p>
+      <w:pPr>
+        <w:rPr>
+          <w:i/>
+        </w:rPr>
+      </w:pPr>
+    </w:p>
+    <w:p>
+      <w:pPr>
+        <w:rPr>
+          <w:i/>
+        </w:rPr>
+      </w:pPr>
+    </w:p>
+    <w:p>
+      <w:pPr>
+        <w:rPr>
+          <w:i/>
+        </w:rPr>
+      </w:pPr>
+      <w:r>
+        <w:rPr>
+          <w:i/>
+        </w:rPr>
+        <w:t xml:space="preserve">111-Colocamos uma cor de fundo na </w:t>
+      </w:r>
+      <w:proofErr w:type="spellStart"/>
+      <w:r>
+        <w:rPr>
+          <w:i/>
+        </w:rPr>
+        <w:t>section</w:t>
+      </w:r>
+      <w:proofErr w:type="spellEnd"/>
+      <w:r>
+        <w:rPr>
+          <w:i/>
+        </w:rPr>
+        <w:t xml:space="preserve"> benefícios </w:t>
+      </w:r>
+      <w:r>
+        <w:rPr>
+          <w:i/>
+        </w:rPr>
+        <w:t xml:space="preserve">para </w:t>
+      </w:r>
+      <w:r>
+        <w:rPr>
+          <w:i/>
+        </w:rPr>
+        <w:t>realizar o nosso degrade.</w:t>
+      </w:r>
+    </w:p>
+    <w:p>
+      <w:pPr>
+        <w:rPr>
+          <w:i/>
+        </w:rPr>
+      </w:pPr>
+    </w:p>
+    <w:p>
+      <w:pPr>
+        <w:rPr>
+          <w:i/>
+        </w:rPr>
+      </w:pPr>
+    </w:p>
+    <w:p>
+      <w:pPr>
+        <w:rPr>
+          <w:i/>
+        </w:rPr>
+      </w:pPr>
+      <w:r>
+        <w:rPr>
+          <w:i/>
+        </w:rPr>
+        <w:t xml:space="preserve">112-Para fazer o degrade tiramos o </w:t>
+      </w:r>
+      <w:proofErr w:type="spellStart"/>
+      <w:r>
+        <w:rPr>
+          <w:i/>
+        </w:rPr>
+        <w:t>main</w:t>
+      </w:r>
+      <w:proofErr w:type="spellEnd"/>
+      <w:r>
+        <w:rPr>
+          <w:i/>
+        </w:rPr>
+        <w:t xml:space="preserve"> que </w:t>
+      </w:r>
+      <w:proofErr w:type="spellStart"/>
+      <w:r>
+        <w:rPr>
+          <w:i/>
+        </w:rPr>
+        <w:t>estav</w:t>
+      </w:r>
+      <w:proofErr w:type="spellEnd"/>
+      <w:r>
+        <w:rPr>
+          <w:i/>
+        </w:rPr>
+        <w:t xml:space="preserve"> configurando para a largura de 940px e centralizando o elemento em </w:t>
+      </w:r>
+      <w:proofErr w:type="spellStart"/>
+      <w:r>
+        <w:rPr>
+          <w:i/>
+        </w:rPr>
+        <w:t>margin</w:t>
+      </w:r>
+      <w:proofErr w:type="spellEnd"/>
+      <w:r>
+        <w:rPr>
+          <w:i/>
+        </w:rPr>
+        <w:t xml:space="preserve"> :0 auto, com ao colocar a cor de fundo nas </w:t>
+      </w:r>
+      <w:proofErr w:type="spellStart"/>
+      <w:r>
+        <w:rPr>
+          <w:i/>
+        </w:rPr>
+        <w:t>section</w:t>
+      </w:r>
+      <w:proofErr w:type="spellEnd"/>
+      <w:r>
+        <w:rPr>
+          <w:i/>
+        </w:rPr>
+        <w:t xml:space="preserve"> que estava dentro do </w:t>
+      </w:r>
+      <w:proofErr w:type="spellStart"/>
+      <w:r>
+        <w:rPr>
+          <w:i/>
+        </w:rPr>
+        <w:t>main</w:t>
+      </w:r>
+      <w:proofErr w:type="spellEnd"/>
+      <w:r>
+        <w:rPr>
+          <w:i/>
+        </w:rPr>
+        <w:t xml:space="preserve"> s </w:t>
+      </w:r>
+      <w:proofErr w:type="spellStart"/>
+      <w:r>
+        <w:rPr>
+          <w:i/>
+        </w:rPr>
+        <w:t>cors</w:t>
+      </w:r>
+      <w:proofErr w:type="spellEnd"/>
+      <w:r>
+        <w:rPr>
+          <w:i/>
+        </w:rPr>
+        <w:t xml:space="preserve"> ficavam centralizadas. Para resolver colocamos o </w:t>
+      </w:r>
+      <w:proofErr w:type="spellStart"/>
+      <w:r>
+        <w:rPr>
+          <w:i/>
+        </w:rPr>
+        <w:t>margin</w:t>
+      </w:r>
+      <w:proofErr w:type="spellEnd"/>
+      <w:r>
+        <w:rPr>
+          <w:i/>
+        </w:rPr>
+        <w:t xml:space="preserve"> 0 auto e </w:t>
+      </w:r>
+      <w:proofErr w:type="spellStart"/>
+      <w:r>
+        <w:rPr>
+          <w:i/>
+        </w:rPr>
+        <w:t>width</w:t>
+      </w:r>
+      <w:proofErr w:type="spellEnd"/>
+      <w:r>
+        <w:rPr>
+          <w:i/>
+        </w:rPr>
+        <w:t xml:space="preserve"> 940px na </w:t>
+      </w:r>
+      <w:proofErr w:type="spellStart"/>
+      <w:r>
+        <w:rPr>
+          <w:i/>
+        </w:rPr>
+        <w:t>section</w:t>
+      </w:r>
+      <w:proofErr w:type="spellEnd"/>
+      <w:r>
+        <w:rPr>
+          <w:i/>
+        </w:rPr>
+        <w:t xml:space="preserve"> principal e </w:t>
+      </w:r>
+      <w:proofErr w:type="spellStart"/>
+      <w:r>
+        <w:rPr>
+          <w:i/>
+        </w:rPr>
+        <w:t>section</w:t>
+      </w:r>
+      <w:proofErr w:type="spellEnd"/>
+      <w:r>
+        <w:rPr>
+          <w:i/>
+        </w:rPr>
+        <w:t xml:space="preserve"> mapa e no </w:t>
+      </w:r>
+      <w:proofErr w:type="spellStart"/>
+      <w:r>
+        <w:rPr>
+          <w:i/>
+        </w:rPr>
+        <w:t>section</w:t>
+      </w:r>
+      <w:proofErr w:type="spellEnd"/>
+      <w:r>
+        <w:rPr>
+          <w:i/>
+        </w:rPr>
+        <w:t xml:space="preserve"> benefícios.</w:t>
+      </w:r>
+    </w:p>
+    <w:p>
+      <w:pPr>
+        <w:rPr>
+          <w:i/>
+        </w:rPr>
+      </w:pPr>
+    </w:p>
+    <w:p>
+      <w:pPr>
+        <w:rPr>
+          <w:i/>
+        </w:rPr>
+      </w:pPr>
+      <w:proofErr w:type="spellStart"/>
+      <w:proofErr w:type="gramStart"/>
+      <w:r>
+        <w:rPr>
+          <w:i/>
+        </w:rPr>
+        <w:t>m</w:t>
+      </w:r>
+      <w:r>
+        <w:rPr>
+          <w:i/>
+        </w:rPr>
+        <w:t>ain</w:t>
+      </w:r>
+      <w:proofErr w:type="spellEnd"/>
+      <w:r>
+        <w:rPr>
+          <w:i/>
+        </w:rPr>
+        <w:t>{</w:t>
+      </w:r>
+      <w:proofErr w:type="gramEnd"/>
+    </w:p>
+    <w:p>
+      <w:pPr>
+        <w:rPr>
+          <w:i/>
+        </w:rPr>
+      </w:pPr>
+      <w:proofErr w:type="spellStart"/>
+      <w:r>
+        <w:rPr>
+          <w:i/>
+        </w:rPr>
+        <w:t>width</w:t>
+      </w:r>
+      <w:proofErr w:type="spellEnd"/>
+      <w:r>
+        <w:rPr>
+          <w:i/>
+        </w:rPr>
+        <w:t>: 940px;</w:t>
+      </w:r>
+    </w:p>
+    <w:p>
+      <w:pPr>
+        <w:rPr>
+          <w:i/>
+        </w:rPr>
+      </w:pPr>
+      <w:proofErr w:type="spellStart"/>
+      <w:r>
+        <w:rPr>
+          <w:i/>
+        </w:rPr>
+        <w:t>margin</w:t>
+      </w:r>
+      <w:proofErr w:type="spellEnd"/>
+      <w:r>
+        <w:rPr>
+          <w:i/>
+        </w:rPr>
+        <w:t>: 0 auto;</w:t>
+      </w:r>
+    </w:p>
+    <w:p>
+      <w:pPr>
+        <w:rPr>
+          <w:i/>
+        </w:rPr>
+      </w:pPr>
+      <w:r>
+        <w:rPr>
+          <w:i/>
+        </w:rPr>
+        <w:t>}</w:t>
+      </w:r>
+    </w:p>
+    <w:p>
+      <w:pPr>
+        <w:rPr>
+          <w:i/>
+        </w:rPr>
+      </w:pPr>
+      <w:r>
+        <w:rPr>
+          <w:i/>
+        </w:rPr>
+        <w:t xml:space="preserve">Isso fazia com que todo o conteúdo do </w:t>
+      </w:r>
+      <w:proofErr w:type="spellStart"/>
+      <w:r>
+        <w:rPr>
+          <w:b/>
+          <w:i/>
+        </w:rPr>
+        <w:t>main</w:t>
+      </w:r>
+      <w:proofErr w:type="spellEnd"/>
+      <w:r>
+        <w:rPr>
+          <w:b/>
+          <w:i/>
+        </w:rPr>
+        <w:t xml:space="preserve"> </w:t>
+      </w:r>
+      <w:r>
+        <w:rPr>
+          <w:i/>
+        </w:rPr>
+        <w:t xml:space="preserve">ficasse limitado a </w:t>
+      </w:r>
+      <w:r>
+        <w:rPr>
+          <w:b/>
+          <w:i/>
+        </w:rPr>
+        <w:t>940px</w:t>
+      </w:r>
+      <w:r>
+        <w:rPr>
+          <w:i/>
+        </w:rPr>
+        <w:t xml:space="preserve"> e </w:t>
+      </w:r>
+      <w:r>
+        <w:rPr>
+          <w:b/>
+          <w:i/>
+        </w:rPr>
+        <w:t xml:space="preserve">centralizamos na </w:t>
+      </w:r>
+      <w:proofErr w:type="spellStart"/>
+      <w:r>
+        <w:rPr>
+          <w:b/>
+          <w:i/>
+        </w:rPr>
+        <w:t>pagina</w:t>
+      </w:r>
+      <w:proofErr w:type="spellEnd"/>
+      <w:r>
+        <w:rPr>
+          <w:b/>
+          <w:i/>
+        </w:rPr>
+        <w:t xml:space="preserve">. </w:t>
+      </w:r>
+      <w:r>
+        <w:rPr>
+          <w:i/>
+        </w:rPr>
+        <w:t xml:space="preserve">Consequentemente, quando colocávamos uma cor de fundo nas </w:t>
+      </w:r>
+      <w:proofErr w:type="spellStart"/>
+      <w:r>
+        <w:rPr>
+          <w:b/>
+          <w:i/>
+        </w:rPr>
+        <w:t>section</w:t>
+      </w:r>
+      <w:proofErr w:type="spellEnd"/>
+      <w:r>
+        <w:rPr>
+          <w:i/>
+        </w:rPr>
+        <w:t xml:space="preserve">. O fundo também ficava limitado </w:t>
+      </w:r>
+      <w:proofErr w:type="spellStart"/>
+      <w:r>
+        <w:rPr>
+          <w:i/>
+        </w:rPr>
+        <w:t>á</w:t>
+      </w:r>
+      <w:proofErr w:type="spellEnd"/>
+      <w:r>
+        <w:rPr>
+          <w:i/>
+        </w:rPr>
+        <w:t xml:space="preserve"> mesma largura.</w:t>
+      </w:r>
+    </w:p>
+    <w:p>
+      <w:pPr>
+        <w:rPr>
+          <w:i/>
+        </w:rPr>
+      </w:pPr>
+      <w:r>
+        <w:rPr>
+          <w:i/>
+        </w:rPr>
+        <w:t xml:space="preserve">Para permitir que cada seção tivesse seu próprio fundo e, ao mesmo tempo, manter o conteúdo centralizado, retiramos o </w:t>
+      </w:r>
+      <w:proofErr w:type="spellStart"/>
+      <w:r>
+        <w:rPr>
+          <w:b/>
+          <w:i/>
+        </w:rPr>
+        <w:t>width</w:t>
+      </w:r>
+      <w:proofErr w:type="spellEnd"/>
+      <w:r>
+        <w:rPr>
+          <w:b/>
+          <w:i/>
+        </w:rPr>
+        <w:t xml:space="preserve"> </w:t>
+      </w:r>
+      <w:r>
+        <w:rPr>
+          <w:i/>
+        </w:rPr>
+        <w:t xml:space="preserve">e o </w:t>
+      </w:r>
+      <w:proofErr w:type="spellStart"/>
+      <w:r>
+        <w:rPr>
+          <w:b/>
+          <w:i/>
+        </w:rPr>
+        <w:t>margin</w:t>
+      </w:r>
+      <w:proofErr w:type="spellEnd"/>
+      <w:r>
+        <w:rPr>
+          <w:b/>
+          <w:i/>
+        </w:rPr>
+        <w:t xml:space="preserve"> </w:t>
+      </w:r>
+      <w:r>
+        <w:rPr>
+          <w:i/>
+        </w:rPr>
+        <w:t xml:space="preserve">do </w:t>
+      </w:r>
+      <w:proofErr w:type="spellStart"/>
+      <w:r>
+        <w:rPr>
+          <w:b/>
+          <w:i/>
+        </w:rPr>
+        <w:t>main</w:t>
+      </w:r>
+      <w:proofErr w:type="spellEnd"/>
+      <w:r>
+        <w:rPr>
+          <w:b/>
+          <w:i/>
+        </w:rPr>
+        <w:t xml:space="preserve"> </w:t>
+      </w:r>
+      <w:r>
+        <w:rPr>
+          <w:i/>
+        </w:rPr>
+        <w:t xml:space="preserve">e passamos esse controle para seções principais: </w:t>
+      </w:r>
+    </w:p>
+    <w:p>
+      <w:pPr>
+        <w:rPr>
+          <w:i/>
+        </w:rPr>
+      </w:pPr>
+      <w:r>
+        <w:rPr>
+          <w:i/>
+        </w:rPr>
+        <w:t xml:space="preserve">Ao fazer também percebemos que o mapa não ficou centralizado para criamos uma </w:t>
+      </w:r>
+      <w:proofErr w:type="spellStart"/>
+      <w:r>
+        <w:rPr>
+          <w:i/>
+        </w:rPr>
+        <w:t>div</w:t>
+      </w:r>
+      <w:proofErr w:type="spellEnd"/>
+      <w:r>
+        <w:rPr>
+          <w:i/>
+        </w:rPr>
+        <w:t xml:space="preserve"> que envolve o mapa chamada mapa </w:t>
+      </w:r>
+      <w:proofErr w:type="spellStart"/>
+      <w:r>
+        <w:rPr>
+          <w:i/>
+        </w:rPr>
+        <w:t>conteudp</w:t>
+      </w:r>
+      <w:proofErr w:type="spellEnd"/>
+      <w:r>
+        <w:rPr>
+          <w:i/>
+        </w:rPr>
+        <w:t xml:space="preserve"> que colocamos também o </w:t>
+      </w:r>
+      <w:proofErr w:type="spellStart"/>
+      <w:r>
+        <w:rPr>
+          <w:i/>
+        </w:rPr>
+        <w:t>width</w:t>
+      </w:r>
+      <w:proofErr w:type="spellEnd"/>
+      <w:r>
+        <w:rPr>
+          <w:i/>
+        </w:rPr>
+        <w:t xml:space="preserve"> 940px e </w:t>
+      </w:r>
+      <w:proofErr w:type="spellStart"/>
+      <w:r>
+        <w:rPr>
+          <w:i/>
+        </w:rPr>
+        <w:t>margin</w:t>
+      </w:r>
+      <w:proofErr w:type="spellEnd"/>
+      <w:r>
+        <w:rPr>
+          <w:i/>
+        </w:rPr>
+        <w:t xml:space="preserve"> 0 auto.</w:t>
+      </w:r>
+    </w:p>
+    <w:p>
+      <w:pPr>
+        <w:rPr>
+          <w:i/>
+        </w:rPr>
+      </w:pPr>
+      <w:r>
+        <w:rPr>
+          <w:i/>
+        </w:rPr>
+        <w:t xml:space="preserve">Na </w:t>
+      </w:r>
+      <w:proofErr w:type="spellStart"/>
+      <w:proofErr w:type="gramStart"/>
+      <w:r>
+        <w:rPr>
+          <w:i/>
+        </w:rPr>
+        <w:t>class</w:t>
+      </w:r>
+      <w:proofErr w:type="spellEnd"/>
+      <w:r>
+        <w:rPr>
+          <w:i/>
+        </w:rPr>
+        <w:t xml:space="preserve"> .mapa</w:t>
+      </w:r>
+      <w:proofErr w:type="gramEnd"/>
+      <w:r>
+        <w:rPr>
+          <w:i/>
+        </w:rPr>
+        <w:t xml:space="preserve"> colocamos o degrade para fazer essa core sobre posta porque o mapa </w:t>
+      </w:r>
+      <w:proofErr w:type="spellStart"/>
+      <w:r>
+        <w:rPr>
+          <w:i/>
+        </w:rPr>
+        <w:t>esta</w:t>
+      </w:r>
+      <w:proofErr w:type="spellEnd"/>
+      <w:r>
+        <w:rPr>
+          <w:i/>
+        </w:rPr>
+        <w:t xml:space="preserve"> a </w:t>
+      </w:r>
+      <w:proofErr w:type="spellStart"/>
+      <w:r>
+        <w:rPr>
+          <w:i/>
+        </w:rPr>
+        <w:t>section</w:t>
+      </w:r>
+      <w:proofErr w:type="spellEnd"/>
+      <w:r>
+        <w:rPr>
+          <w:i/>
+        </w:rPr>
+        <w:t xml:space="preserve"> principal e a benefícios onde queríamos fazer o degrade </w:t>
+      </w:r>
+    </w:p>
+    <w:p>
+      <w:pPr>
+        <w:rPr>
+          <w:i/>
+        </w:rPr>
+      </w:pPr>
+    </w:p>
+    <w:p>
+      <w:pPr>
+        <w:rPr>
+          <w:i/>
+        </w:rPr>
+      </w:pPr>
+      <w:r>
+        <w:rPr>
+          <w:i/>
+          <w:noProof/>
+        </w:rPr>
+        <w:drawing>
+          <wp:inline distT="0" distB="0" distL="0" distR="0" wp14:anchorId="5D6FA2E5" wp14:editId="3EDE223C">
+            <wp:extent cx="2517568" cy="1020636"/>
+            <wp:effectExtent l="0" t="0" r="0" b="8255"/>
+            <wp:docPr id="155" name="Imagem 155"/>
+            <wp:cNvGraphicFramePr>
+              <a:graphicFrameLocks xmlns:a="http://schemas.openxmlformats.org/drawingml/2006/main" noChangeAspect="1"/>
+            </wp:cNvGraphicFramePr>
+            <a:graphic xmlns:a="http://schemas.openxmlformats.org/drawingml/2006/main">
+              <a:graphicData uri="http://schemas.openxmlformats.org/drawingml/2006/picture">
+                <pic:pic xmlns:pic="http://schemas.openxmlformats.org/drawingml/2006/picture">
+                  <pic:nvPicPr>
+                    <pic:cNvPr id="1" name=""/>
+                    <pic:cNvPicPr/>
+                  </pic:nvPicPr>
+                  <pic:blipFill>
+                    <a:blip r:embed="rId164"/>
+                    <a:stretch>
+                      <a:fillRect/>
+                    </a:stretch>
+                  </pic:blipFill>
+                  <pic:spPr>
+                    <a:xfrm>
+                      <a:off x="0" y="0"/>
+                      <a:ext cx="2547277" cy="1032680"/>
+                    </a:xfrm>
+                    <a:prstGeom prst="rect">
+                      <a:avLst/>
+                    </a:prstGeom>
+                  </pic:spPr>
+                </pic:pic>
+              </a:graphicData>
+            </a:graphic>
+          </wp:inline>
+        </w:drawing>
+      </w:r>
+    </w:p>
+    <w:p>
+      <w:pPr>
+        <w:rPr>
+          <w:i/>
+        </w:rPr>
+      </w:pPr>
+      <w:r>
+        <w:rPr>
+          <w:i/>
+          <w:noProof/>
+        </w:rPr>
+        <w:drawing>
+          <wp:inline distT="0" distB="0" distL="0" distR="0" wp14:anchorId="1A3301D3">
+            <wp:extent cx="3800103" cy="974491"/>
+            <wp:effectExtent l="0" t="0" r="0" b="0"/>
+            <wp:docPr id="156" name="Imagem 156"/>
+            <wp:cNvGraphicFramePr>
+              <a:graphicFrameLocks xmlns:a="http://schemas.openxmlformats.org/drawingml/2006/main" noChangeAspect="1"/>
+            </wp:cNvGraphicFramePr>
+            <a:graphic xmlns:a="http://schemas.openxmlformats.org/drawingml/2006/main">
+              <a:graphicData uri="http://schemas.openxmlformats.org/drawingml/2006/picture">
+                <pic:pic xmlns:pic="http://schemas.openxmlformats.org/drawingml/2006/picture">
+                  <pic:nvPicPr>
+                    <pic:cNvPr id="0" name="Picture 2"/>
+                    <pic:cNvPicPr>
+                      <a:picLocks noChangeAspect="1" noChangeArrowheads="1"/>
+                    </pic:cNvPicPr>
+                  </pic:nvPicPr>
+                  <pic:blipFill>
+                    <a:blip r:embed="rId165">
+                      <a:extLst>
+                        <a:ext uri="{28A0092B-C50C-407E-A947-70E740481C1C}">
+                          <a14:useLocalDpi xmlns:a14="http://schemas.microsoft.com/office/drawing/2010/main" val="0"/>
+                        </a:ext>
+                      </a:extLst>
+                    </a:blip>
+                    <a:srcRect/>
+                    <a:stretch>
+                      <a:fillRect/>
+                    </a:stretch>
+                  </pic:blipFill>
+                  <pic:spPr bwMode="auto">
+                    <a:xfrm>
+                      <a:off x="0" y="0"/>
+                      <a:ext cx="3839107" cy="984493"/>
+                    </a:xfrm>
+                    <a:prstGeom prst="rect">
+                      <a:avLst/>
+                    </a:prstGeom>
+                    <a:noFill/>
+                  </pic:spPr>
+                </pic:pic>
+              </a:graphicData>
+            </a:graphic>
+          </wp:inline>
+        </w:drawing>
+      </w:r>
+    </w:p>
+    <w:p>
+      <w:pPr>
+        <w:rPr>
+          <w:i/>
+        </w:rPr>
+      </w:pPr>
+      <w:r>
+        <w:rPr>
+          <w:i/>
+          <w:noProof/>
+        </w:rPr>
+        <w:drawing>
+          <wp:inline distT="0" distB="0" distL="0" distR="0" wp14:anchorId="1DFE2981">
+            <wp:extent cx="2018805" cy="709909"/>
+            <wp:effectExtent l="0" t="0" r="635" b="0"/>
+            <wp:docPr id="157" name="Imagem 157"/>
+            <wp:cNvGraphicFramePr>
+              <a:graphicFrameLocks xmlns:a="http://schemas.openxmlformats.org/drawingml/2006/main" noChangeAspect="1"/>
+            </wp:cNvGraphicFramePr>
+            <a:graphic xmlns:a="http://schemas.openxmlformats.org/drawingml/2006/main">
+              <a:graphicData uri="http://schemas.openxmlformats.org/drawingml/2006/picture">
+                <pic:pic xmlns:pic="http://schemas.openxmlformats.org/drawingml/2006/picture">
+                  <pic:nvPicPr>
+                    <pic:cNvPr id="0" name="Picture 3"/>
+                    <pic:cNvPicPr>
+                      <a:picLocks noChangeAspect="1" noChangeArrowheads="1"/>
+                    </pic:cNvPicPr>
+                  </pic:nvPicPr>
+                  <pic:blipFill>
+                    <a:blip r:embed="rId166">
+                      <a:extLst>
+                        <a:ext uri="{28A0092B-C50C-407E-A947-70E740481C1C}">
+                          <a14:useLocalDpi xmlns:a14="http://schemas.microsoft.com/office/drawing/2010/main" val="0"/>
+                        </a:ext>
+                      </a:extLst>
+                    </a:blip>
+                    <a:srcRect/>
+                    <a:stretch>
+                      <a:fillRect/>
+                    </a:stretch>
+                  </pic:blipFill>
+                  <pic:spPr bwMode="auto">
+                    <a:xfrm>
+                      <a:off x="0" y="0"/>
+                      <a:ext cx="2039406" cy="717153"/>
+                    </a:xfrm>
+                    <a:prstGeom prst="rect">
+                      <a:avLst/>
+                    </a:prstGeom>
+                    <a:noFill/>
+                  </pic:spPr>
+                </pic:pic>
+              </a:graphicData>
+            </a:graphic>
+          </wp:inline>
+        </w:drawing>
+      </w:r>
+    </w:p>
+    <w:p>
+      <w:pPr>
+        <w:rPr>
+          <w:i/>
+        </w:rPr>
+      </w:pPr>
+      <w:r>
+        <w:rPr>
+          <w:i/>
+          <w:noProof/>
+        </w:rPr>
+        <w:drawing>
+          <wp:inline distT="0" distB="0" distL="0" distR="0" wp14:anchorId="7C3655D2">
+            <wp:extent cx="5758900" cy="1175658"/>
+            <wp:effectExtent l="0" t="0" r="0" b="5715"/>
+            <wp:docPr id="158" name="Imagem 158"/>
+            <wp:cNvGraphicFramePr>
+              <a:graphicFrameLocks xmlns:a="http://schemas.openxmlformats.org/drawingml/2006/main" noChangeAspect="1"/>
+            </wp:cNvGraphicFramePr>
+            <a:graphic xmlns:a="http://schemas.openxmlformats.org/drawingml/2006/main">
+              <a:graphicData uri="http://schemas.openxmlformats.org/drawingml/2006/picture">
+                <pic:pic xmlns:pic="http://schemas.openxmlformats.org/drawingml/2006/picture">
+                  <pic:nvPicPr>
+                    <pic:cNvPr id="0" name="Picture 4"/>
+                    <pic:cNvPicPr>
+                      <a:picLocks noChangeAspect="1" noChangeArrowheads="1"/>
+                    </pic:cNvPicPr>
+                  </pic:nvPicPr>
+                  <pic:blipFill>
+                    <a:blip r:embed="rId167">
+                      <a:extLst>
+                        <a:ext uri="{28A0092B-C50C-407E-A947-70E740481C1C}">
+                          <a14:useLocalDpi xmlns:a14="http://schemas.microsoft.com/office/drawing/2010/main" val="0"/>
+                        </a:ext>
+                      </a:extLst>
+                    </a:blip>
+                    <a:srcRect/>
+                    <a:stretch>
+                      <a:fillRect/>
+                    </a:stretch>
+                  </pic:blipFill>
+                  <pic:spPr bwMode="auto">
+                    <a:xfrm>
+                      <a:off x="0" y="0"/>
+                      <a:ext cx="5899136" cy="1204287"/>
+                    </a:xfrm>
+                    <a:prstGeom prst="rect">
+                      <a:avLst/>
+                    </a:prstGeom>
+                    <a:noFill/>
+                  </pic:spPr>
+                </pic:pic>
+              </a:graphicData>
+            </a:graphic>
+          </wp:inline>
+        </w:drawing>
+      </w:r>
+    </w:p>
+    <w:p>
+      <w:pPr>
+        <w:rPr>
+          <w:i/>
+        </w:rPr>
+      </w:pPr>
+    </w:p>
+    <w:p>
+      <w:pPr>
+        <w:rPr>
+          <w:i/>
+        </w:rPr>
+      </w:pPr>
+      <w:r>
+        <w:rPr>
+          <w:i/>
+        </w:rPr>
+        <w:t>113-</w:t>
+      </w:r>
+      <w:r>
+        <w:rPr>
+          <w:i/>
+        </w:rPr>
+        <w:t xml:space="preserve">Centralizando o mapa </w:t>
+      </w:r>
+    </w:p>
+    <w:p>
+      <w:pPr>
+        <w:rPr>
+          <w:i/>
+        </w:rPr>
+      </w:pPr>
+      <w:r>
+        <w:rPr>
+          <w:i/>
+        </w:rPr>
+        <w:t xml:space="preserve">Durante os </w:t>
+      </w:r>
+      <w:proofErr w:type="spellStart"/>
+      <w:r>
+        <w:rPr>
+          <w:i/>
+        </w:rPr>
+        <w:t>aj</w:t>
+      </w:r>
+      <w:r>
+        <w:rPr>
+          <w:i/>
+        </w:rPr>
+        <w:t>t</w:t>
+      </w:r>
+      <w:r>
+        <w:rPr>
+          <w:i/>
+        </w:rPr>
+        <w:t>s</w:t>
+      </w:r>
+      <w:proofErr w:type="spellEnd"/>
+      <w:r>
+        <w:rPr>
+          <w:i/>
+        </w:rPr>
+        <w:t xml:space="preserve">, percebemos que o mapa também não estava centralizado corretamente </w:t>
+      </w:r>
+    </w:p>
+    <w:p>
+      <w:pPr>
+        <w:rPr>
+          <w:i/>
+        </w:rPr>
+      </w:pPr>
+      <w:r>
+        <w:rPr>
+          <w:i/>
+        </w:rPr>
+        <w:t xml:space="preserve">Para solucionar esse problema, criamos uma </w:t>
+      </w:r>
+      <w:proofErr w:type="spellStart"/>
+      <w:r>
+        <w:rPr>
+          <w:b/>
+          <w:i/>
+        </w:rPr>
+        <w:t>div</w:t>
+      </w:r>
+      <w:proofErr w:type="spellEnd"/>
+      <w:r>
+        <w:rPr>
+          <w:b/>
+          <w:i/>
+        </w:rPr>
+        <w:t xml:space="preserve"> </w:t>
+      </w:r>
+      <w:proofErr w:type="gramStart"/>
+      <w:r>
+        <w:rPr>
+          <w:i/>
+        </w:rPr>
+        <w:t xml:space="preserve">chamada </w:t>
+      </w:r>
+      <w:r>
+        <w:rPr>
+          <w:b/>
+          <w:i/>
+        </w:rPr>
+        <w:t>.mapa</w:t>
+      </w:r>
+      <w:proofErr w:type="gramEnd"/>
+      <w:r>
+        <w:rPr>
+          <w:b/>
+          <w:i/>
+        </w:rPr>
+        <w:t>-</w:t>
+      </w:r>
+      <w:proofErr w:type="spellStart"/>
+      <w:r>
+        <w:rPr>
+          <w:b/>
+          <w:i/>
+        </w:rPr>
+        <w:t>conteudo</w:t>
+      </w:r>
+      <w:proofErr w:type="spellEnd"/>
+      <w:r>
+        <w:rPr>
+          <w:b/>
+          <w:i/>
+        </w:rPr>
+        <w:t xml:space="preserve">. </w:t>
+      </w:r>
+      <w:r>
+        <w:rPr>
+          <w:i/>
+        </w:rPr>
+        <w:t>Responsável por envolver o mapa</w:t>
+      </w:r>
+    </w:p>
+    <w:p>
+      <w:pPr>
+        <w:rPr>
+          <w:i/>
+        </w:rPr>
+      </w:pPr>
+      <w:r>
+        <w:rPr>
+          <w:i/>
+          <w:noProof/>
+        </w:rPr>
+        <w:drawing>
+          <wp:inline distT="0" distB="0" distL="0" distR="0" wp14:anchorId="3A7FD960">
+            <wp:extent cx="5096510" cy="857250"/>
+            <wp:effectExtent l="0" t="0" r="8890" b="0"/>
+            <wp:docPr id="159" name="Imagem 159"/>
+            <wp:cNvGraphicFramePr>
+              <a:graphicFrameLocks xmlns:a="http://schemas.openxmlformats.org/drawingml/2006/main" noChangeAspect="1"/>
+            </wp:cNvGraphicFramePr>
+            <a:graphic xmlns:a="http://schemas.openxmlformats.org/drawingml/2006/main">
+              <a:graphicData uri="http://schemas.openxmlformats.org/drawingml/2006/picture">
+                <pic:pic xmlns:pic="http://schemas.openxmlformats.org/drawingml/2006/picture">
+                  <pic:nvPicPr>
+                    <pic:cNvPr id="0" name="Picture 5"/>
+                    <pic:cNvPicPr>
+                      <a:picLocks noChangeAspect="1" noChangeArrowheads="1"/>
+                    </pic:cNvPicPr>
+                  </pic:nvPicPr>
+                  <pic:blipFill>
+                    <a:blip r:embed="rId168">
+                      <a:extLst>
+                        <a:ext uri="{28A0092B-C50C-407E-A947-70E740481C1C}">
+                          <a14:useLocalDpi xmlns:a14="http://schemas.microsoft.com/office/drawing/2010/main" val="0"/>
+                        </a:ext>
+                      </a:extLst>
+                    </a:blip>
+                    <a:srcRect/>
+                    <a:stretch>
+                      <a:fillRect/>
+                    </a:stretch>
+                  </pic:blipFill>
+                  <pic:spPr bwMode="auto">
+                    <a:xfrm>
+                      <a:off x="0" y="0"/>
+                      <a:ext cx="5096510" cy="857250"/>
+                    </a:xfrm>
+                    <a:prstGeom prst="rect">
+                      <a:avLst/>
+                    </a:prstGeom>
+                    <a:noFill/>
+                  </pic:spPr>
+                </pic:pic>
+              </a:graphicData>
+            </a:graphic>
+          </wp:inline>
+        </w:drawing>
+      </w:r>
+    </w:p>
+    <w:p>
+      <w:pPr>
+        <w:rPr>
+          <w:i/>
+        </w:rPr>
+      </w:pPr>
+      <w:r>
+        <w:rPr>
+          <w:i/>
+          <w:noProof/>
+        </w:rPr>
+        <w:drawing>
+          <wp:inline distT="0" distB="0" distL="0" distR="0" wp14:anchorId="61D36EE0">
+            <wp:extent cx="1888176" cy="820273"/>
+            <wp:effectExtent l="0" t="0" r="0" b="0"/>
+            <wp:docPr id="160" name="Imagem 160"/>
+            <wp:cNvGraphicFramePr>
+              <a:graphicFrameLocks xmlns:a="http://schemas.openxmlformats.org/drawingml/2006/main" noChangeAspect="1"/>
+            </wp:cNvGraphicFramePr>
+            <a:graphic xmlns:a="http://schemas.openxmlformats.org/drawingml/2006/main">
+              <a:graphicData uri="http://schemas.openxmlformats.org/drawingml/2006/picture">
+                <pic:pic xmlns:pic="http://schemas.openxmlformats.org/drawingml/2006/picture">
+                  <pic:nvPicPr>
+                    <pic:cNvPr id="0" name="Picture 6"/>
+                    <pic:cNvPicPr>
+                      <a:picLocks noChangeAspect="1" noChangeArrowheads="1"/>
+                    </pic:cNvPicPr>
+                  </pic:nvPicPr>
+                  <pic:blipFill>
+                    <a:blip r:embed="rId169">
+                      <a:extLst>
+                        <a:ext uri="{28A0092B-C50C-407E-A947-70E740481C1C}">
+                          <a14:useLocalDpi xmlns:a14="http://schemas.microsoft.com/office/drawing/2010/main" val="0"/>
+                        </a:ext>
+                      </a:extLst>
+                    </a:blip>
+                    <a:srcRect/>
+                    <a:stretch>
+                      <a:fillRect/>
+                    </a:stretch>
+                  </pic:blipFill>
+                  <pic:spPr bwMode="auto">
+                    <a:xfrm>
+                      <a:off x="0" y="0"/>
+                      <a:ext cx="1918899" cy="833620"/>
+                    </a:xfrm>
+                    <a:prstGeom prst="rect">
+                      <a:avLst/>
+                    </a:prstGeom>
+                    <a:noFill/>
+                  </pic:spPr>
+                </pic:pic>
+              </a:graphicData>
+            </a:graphic>
+          </wp:inline>
+        </w:drawing>
+      </w:r>
+    </w:p>
+    <w:p>
+      <w:pPr>
+        <w:rPr>
+          <w:i/>
+        </w:rPr>
+      </w:pPr>
+    </w:p>
+    <w:p>
+      <w:pPr>
+        <w:rPr>
+          <w:i/>
+        </w:rPr>
+      </w:pPr>
+      <w:r>
+        <w:rPr>
+          <w:i/>
+        </w:rPr>
+        <w:t xml:space="preserve">114-Dessa forma, o </w:t>
+      </w:r>
+      <w:r>
+        <w:rPr>
+          <w:b/>
+          <w:i/>
+        </w:rPr>
+        <w:t xml:space="preserve">fundo da </w:t>
+      </w:r>
+      <w:proofErr w:type="gramStart"/>
+      <w:r>
+        <w:rPr>
+          <w:b/>
+          <w:i/>
+        </w:rPr>
+        <w:t>seção .mapa</w:t>
+      </w:r>
+      <w:proofErr w:type="gramEnd"/>
+      <w:r>
+        <w:rPr>
+          <w:b/>
+          <w:i/>
+        </w:rPr>
+        <w:t xml:space="preserve"> pode ocupa toda área disponível, </w:t>
+      </w:r>
+      <w:r>
+        <w:rPr>
+          <w:i/>
+        </w:rPr>
+        <w:t>enquanto o conteúdo do mapa permanece centralizado em uma largura de</w:t>
+      </w:r>
+      <w:r>
+        <w:rPr>
+          <w:i/>
+        </w:rPr>
+        <w:t xml:space="preserve"> 940px.</w:t>
+      </w:r>
+    </w:p>
+    <w:p>
+      <w:pPr>
+        <w:rPr>
+          <w:b/>
+          <w:i/>
+        </w:rPr>
+      </w:pPr>
+      <w:r>
+        <w:rPr>
+          <w:b/>
+          <w:i/>
+        </w:rPr>
+        <w:tab/>
+        <w:t xml:space="preserve">APLICANDO O DEGRADE </w:t>
+      </w:r>
+    </w:p>
+    <w:p>
+      <w:pPr>
+        <w:rPr>
+          <w:i/>
+        </w:rPr>
+      </w:pPr>
+      <w:r>
+        <w:rPr>
+          <w:i/>
+        </w:rPr>
+        <w:t xml:space="preserve">Por fim, aplicamos o degrade na </w:t>
+      </w:r>
+      <w:proofErr w:type="gramStart"/>
+      <w:r>
+        <w:rPr>
+          <w:i/>
+        </w:rPr>
+        <w:t>seção .mapa</w:t>
+      </w:r>
+      <w:proofErr w:type="gramEnd"/>
+    </w:p>
+    <w:p>
+      <w:pPr>
+        <w:rPr>
+          <w:i/>
+        </w:rPr>
+      </w:pPr>
+      <w:r>
+        <w:rPr>
+          <w:i/>
+          <w:noProof/>
+        </w:rPr>
+        <w:drawing>
+          <wp:inline distT="0" distB="0" distL="0" distR="0" wp14:anchorId="0834B0F3">
+            <wp:extent cx="3739360" cy="1009403"/>
+            <wp:effectExtent l="0" t="0" r="0" b="635"/>
+            <wp:docPr id="161" name="Imagem 161"/>
+            <wp:cNvGraphicFramePr>
+              <a:graphicFrameLocks xmlns:a="http://schemas.openxmlformats.org/drawingml/2006/main" noChangeAspect="1"/>
+            </wp:cNvGraphicFramePr>
+            <a:graphic xmlns:a="http://schemas.openxmlformats.org/drawingml/2006/main">
+              <a:graphicData uri="http://schemas.openxmlformats.org/drawingml/2006/picture">
+                <pic:pic xmlns:pic="http://schemas.openxmlformats.org/drawingml/2006/picture">
+                  <pic:nvPicPr>
+                    <pic:cNvPr id="0" name="Picture 7"/>
+                    <pic:cNvPicPr>
+                      <a:picLocks noChangeAspect="1" noChangeArrowheads="1"/>
+                    </pic:cNvPicPr>
+                  </pic:nvPicPr>
+                  <pic:blipFill>
+                    <a:blip r:embed="rId170">
+                      <a:extLst>
+                        <a:ext uri="{28A0092B-C50C-407E-A947-70E740481C1C}">
+                          <a14:useLocalDpi xmlns:a14="http://schemas.microsoft.com/office/drawing/2010/main" val="0"/>
+                        </a:ext>
+                      </a:extLst>
+                    </a:blip>
+                    <a:srcRect/>
+                    <a:stretch>
+                      <a:fillRect/>
+                    </a:stretch>
+                  </pic:blipFill>
+                  <pic:spPr bwMode="auto">
+                    <a:xfrm>
+                      <a:off x="0" y="0"/>
+                      <a:ext cx="3806138" cy="1027429"/>
+                    </a:xfrm>
+                    <a:prstGeom prst="rect">
+                      <a:avLst/>
+                    </a:prstGeom>
+                    <a:noFill/>
+                  </pic:spPr>
+                </pic:pic>
+              </a:graphicData>
+            </a:graphic>
+          </wp:inline>
+        </w:drawing>
+      </w:r>
+    </w:p>
+    <w:p>
+      <w:pPr>
+        <w:rPr>
+          <w:i/>
+        </w:rPr>
+      </w:pPr>
+      <w:r>
+        <w:rPr>
+          <w:i/>
+        </w:rPr>
+        <w:t>O objetivo é criar uma transição suave entre as cores das seções. Como o mapa está localizado entre a seção de benefícios, degrade cria uma transição visual entre esses diferentes fundos.</w:t>
+      </w:r>
+    </w:p>
+    <w:bookmarkEnd w:id="0"/>
+    <w:bookmarkEnd w:id="1"/>
+    <w:p>
+      <w:pPr>
+        <w:rPr>
+          <w:i/>
+        </w:rPr>
+      </w:pPr>
     </w:p>
     <w:sectPr>
       <w:pgSz w:w="11906" w:h="16838"/>
@@ -13580,7 +14925,7 @@
 </file>
 
 <file path=customXml/itemProps1.xml><?xml version="1.0" encoding="utf-8"?>
-<ds:datastoreItem xmlns:ds="http://schemas.openxmlformats.org/officeDocument/2006/customXml" ds:itemID="{E21A71DD-2927-4CFA-A459-7176BCB1FB34}">
+<ds:datastoreItem xmlns:ds="http://schemas.openxmlformats.org/officeDocument/2006/customXml" ds:itemID="{0932AC87-1B4C-452E-BE4B-76C33AE683E2}">
   <ds:schemaRefs>
     <ds:schemaRef ds:uri="http://schemas.openxmlformats.org/officeDocument/2006/bibliography"/>
   </ds:schemaRefs>

</xml_diff>